<commit_message>
CONCLUSIONS: el titol del bloc surt sempre a tots els informes amb conclusions
- S'actualitza 0 CONCLUSIONS.docx (versio de l'usuari, amb "CONCLUSIONS"
  centrat i en negreta).
- El titol del bloc ("CONCLUSIONS") ara es detecta com el PRIMER paragraf no
  buit (abans de qualsevol Titol), estigui centrat o no. Abans nomes es
  detectava si estava centrat, de manera que si la plantilla perdia el centrat
  el titol desapareixia de tots els informes. El canvi es fa als DOS parsers:
  Read-Conclusions (REQ1/TERMINI, via Word) i Read-ConclusionsXml (seguiment,
  via XML). A la sortida sempre s'emet centrat i en negreta.
- Nou test: Read-ConclusionsXml detecta el HeaderText.

Proves: run-tests 287 OK, run-tests-actextr 82 OK, run-tests-ruta 57 OK.

Co-Authored-By: Claude Opus 4.8 <noreply@anthropic.com>
Claude-Session: https://claude.ai/code/session_01JMJrmChJ5HaLxF2Q9xTa1S
</commit_message>
<xml_diff>
--- a/ESTRUCTURALS/0 CONCLUSIONS.docx
+++ b/ESTRUCTURALS/0 CONCLUSIONS.docx
@@ -3,9 +3,20 @@
 <w:document xmlns:wpc="http://schemas.microsoft.com/office/word/2010/wordprocessingCanvas" xmlns:cx="http://schemas.microsoft.com/office/drawing/2014/chartex" xmlns:cx1="http://schemas.microsoft.com/office/drawing/2015/9/8/chartex" xmlns:mc="http://schemas.openxmlformats.org/markup-compatibility/2006" xmlns:o="urn:schemas-microsoft-com:office:office" xmlns:r="http://schemas.openxmlformats.org/officeDocument/2006/relationships" xmlns:m="http://schemas.openxmlformats.org/officeDocument/2006/math" xmlns:v="urn:schemas-microsoft-com:vml" xmlns:wp14="http://schemas.microsoft.com/office/word/2010/wordprocessingDrawing" xmlns:wp="http://schemas.openxmlformats.org/drawingml/2006/wordprocessingDrawing" xmlns:w10="urn:schemas-microsoft-com:office:word" xmlns:w="http://schemas.openxmlformats.org/wordprocessingml/2006/main" xmlns:w14="http://schemas.microsoft.com/office/word/2010/wordml" xmlns:w15="http://schemas.microsoft.com/office/word/2012/wordml" xmlns:w16se="http://schemas.microsoft.com/office/word/2015/wordml/symex" xmlns:wpg="http://schemas.microsoft.com/office/word/2010/wordprocessingGroup" xmlns:wpi="http://schemas.microsoft.com/office/word/2010/wordprocessingInk" xmlns:wne="http://schemas.microsoft.com/office/word/2006/wordml" xmlns:wps="http://schemas.microsoft.com/office/word/2010/wordprocessingShape" mc:Ignorable="w14 w15 w16se wp14">
   <w:body>
     <w:p>
-      <w:r>
+      <w:pPr>
+        <w:jc w:val="center"/>
+        <w:rPr>
+          <w:b/>
+        </w:rPr>
+      </w:pPr>
+      <w:r>
+        <w:rPr>
+          <w:b/>
+        </w:rPr>
         <w:t>CONCLUSIONS</w:t>
       </w:r>
+      <w:bookmarkStart w:id="0" w:name="_GoBack"/>
+      <w:bookmarkEnd w:id="0"/>
     </w:p>
     <w:p>
       <w:pPr>
@@ -269,13 +280,7 @@
         <w:rPr>
           <w:lang w:eastAsia="en-US"/>
         </w:rPr>
-        <w:t>NO f</w:t>
-      </w:r>
-      <w:r>
-        <w:rPr>
-          <w:lang w:eastAsia="en-US"/>
-        </w:rPr>
-        <w:t>inalitzat</w:t>
+        <w:t>NO finalitzat</w:t>
       </w:r>
     </w:p>
     <w:p>
@@ -294,13 +299,7 @@
         <w:rPr>
           <w:lang w:eastAsia="en-US"/>
         </w:rPr>
-        <w:t>**</w:t>
-      </w:r>
-      <w:r>
-        <w:rPr>
-          <w:lang w:eastAsia="en-US"/>
-        </w:rPr>
-        <w:t xml:space="preserve">NO </w:t>
+        <w:t xml:space="preserve">**NO </w:t>
       </w:r>
       <w:r>
         <w:rPr>
@@ -332,13 +331,7 @@
         <w:rPr>
           <w:lang w:eastAsia="en-US"/>
         </w:rPr>
-        <w:t>NO finalitzat</w:t>
-      </w:r>
-      <w:r>
-        <w:rPr>
-          <w:lang w:eastAsia="en-US"/>
-        </w:rPr>
-        <w:t xml:space="preserve"> però aixecar cessament</w:t>
+        <w:t>NO finalitzat però aixecar cessament</w:t>
       </w:r>
     </w:p>
     <w:p>
@@ -487,13 +480,7 @@
         <w:rPr>
           <w:lang w:eastAsia="en-US"/>
         </w:rPr>
-        <w:t>tancada la denúncia</w:t>
-      </w:r>
-      <w:r>
-        <w:rPr>
-          <w:lang w:eastAsia="en-US"/>
-        </w:rPr>
-        <w:t>**</w:t>
+        <w:t>tancada la denúncia**</w:t>
       </w:r>
       <w:r>
         <w:rPr>
@@ -513,13 +500,7 @@
         <w:rPr>
           <w:lang w:eastAsia="en-US"/>
         </w:rPr>
-        <w:t>Tancament denúncia</w:t>
-      </w:r>
-      <w:r>
-        <w:rPr>
-          <w:lang w:eastAsia="en-US"/>
-        </w:rPr>
-        <w:t xml:space="preserve"> + inici procediment esmena</w:t>
+        <w:t>Tancament denúncia + inici procediment esmena</w:t>
       </w:r>
     </w:p>
     <w:p>
@@ -583,8 +564,6 @@
         </w:rPr>
         <w:t xml:space="preserve"> aportada en el termini màxim</w:t>
       </w:r>
-      <w:bookmarkStart w:id="0" w:name="_GoBack"/>
-      <w:bookmarkEnd w:id="0"/>
       <w:r>
         <w:rPr>
           <w:lang w:eastAsia="en-US"/>
@@ -4409,7 +4388,7 @@
 </file>
 
 <file path=customXml/itemProps1.xml><?xml version="1.0" encoding="utf-8"?>
-<ds:datastoreItem xmlns:ds="http://schemas.openxmlformats.org/officeDocument/2006/customXml" ds:itemID="{EF72C6B0-0E15-440F-991B-5EFA7D899839}">
+<ds:datastoreItem xmlns:ds="http://schemas.openxmlformats.org/officeDocument/2006/customXml" ds:itemID="{1BE26EFE-6F67-41AB-A064-12D038DB8615}">
   <ds:schemaRefs>
     <ds:schemaRef ds:uri="http://schemas.openxmlformats.org/officeDocument/2006/bibliography"/>
   </ds:schemaRefs>

</xml_diff>

<commit_message>
Plantilles + dades del mobil actualitzades des de Actualitzar.bat
</commit_message>
<xml_diff>
--- a/ESTRUCTURALS/0 CONCLUSIONS.docx
+++ b/ESTRUCTURALS/0 CONCLUSIONS.docx
@@ -15,430 +15,456 @@
         </w:rPr>
         <w:t>CONCLUSIONS</w:t>
       </w:r>
+    </w:p>
+    <w:p>
+      <w:pPr>
+        <w:pStyle w:val="Ttulo1"/>
+      </w:pPr>
+      <w:r>
+        <w:t>REQ1</w:t>
+      </w:r>
+    </w:p>
+    <w:p>
+      <w:pPr>
+        <w:pStyle w:val="Ttulo2"/>
+      </w:pPr>
+      <w:r>
+        <w:t>Desistiment</w:t>
+      </w:r>
+    </w:p>
+    <w:p>
+      <w:r>
+        <w:t xml:space="preserve">Vist l’anterior, com que la comunicació presenta un o més defectes de caràcter essencial </w:t>
+      </w:r>
+      <w:r>
+        <w:t>**</w:t>
+      </w:r>
+      <w:r>
+        <w:t>s’ha de dictar una resolució que deixi sense efecte la comunicació i ordeni el cessament de l'activitat</w:t>
+      </w:r>
+      <w:r>
+        <w:t>**</w:t>
+      </w:r>
+      <w:r>
+        <w:t>.</w:t>
+      </w:r>
       <w:bookmarkStart w:id="0" w:name="_GoBack"/>
       <w:bookmarkEnd w:id="0"/>
     </w:p>
     <w:p>
       <w:pPr>
-        <w:pStyle w:val="Ttulo1"/>
-      </w:pPr>
-      <w:r>
-        <w:t>REQ1</w:t>
+        <w:pStyle w:val="Ttulo2"/>
+      </w:pPr>
+      <w:r>
+        <w:t>Terrassa</w:t>
+      </w:r>
+      <w:r>
+        <w:t xml:space="preserve"> projecte</w:t>
       </w:r>
     </w:p>
     <w:p>
-      <w:pPr>
-        <w:pStyle w:val="Ttulo2"/>
-      </w:pPr>
-      <w:r>
-        <w:t>Terrassa</w:t>
-      </w:r>
-      <w:r>
-        <w:t xml:space="preserve"> projecte</w:t>
+      <w:r>
+        <w:t>La terrassa que apareix en el projecte no forma part d’aquest informe ni d’aquest expedient.</w:t>
       </w:r>
     </w:p>
     <w:p>
-      <w:r>
-        <w:t>La terrassa que apareix en el projecte no forma part d’aquest informe ni d’aquest expedient.</w:t>
+      <w:pPr>
+        <w:pStyle w:val="Ttulo2"/>
+      </w:pPr>
+      <w:r>
+        <w:t>Requeriment</w:t>
       </w:r>
     </w:p>
     <w:p>
-      <w:pPr>
-        <w:pStyle w:val="Ttulo2"/>
-      </w:pPr>
-      <w:r>
-        <w:t>Requeriment</w:t>
+      <w:r>
+        <w:t>Vist l’anterior, cal requerir l’esmena de les deficiències indicades, aportant la documentació corresponent i presentant la mateixa en un termini màxim de quinze dies, a comptar des de l’endemà de la recepció del requeriment.</w:t>
       </w:r>
     </w:p>
     <w:p>
-      <w:r>
-        <w:t>Vist l’anterior, cal requerir l’esmena de les deficiències indicades, aportant la documentació corresponent i presentant la mateixa en un termini màxim de quinze dies, a comptar des de l’endemà de la recepció del requeriment.</w:t>
+      <w:pPr>
+        <w:pStyle w:val="Ttulo2"/>
+      </w:pPr>
+      <w:r>
+        <w:t>Mancances formals</w:t>
       </w:r>
     </w:p>
     <w:p>
-      <w:pPr>
-        <w:pStyle w:val="Ttulo2"/>
-      </w:pPr>
-      <w:r>
-        <w:t>Mancances formals</w:t>
+      <w:r>
+        <w:t>Vist l’anterior, la comunicació presenta mancances formals que s’hauran d’esmenar per tal de poder iniciar l’activitat amb legalitat.</w:t>
       </w:r>
     </w:p>
     <w:p>
-      <w:r>
-        <w:t>Vist l’anterior, la comunicació presenta mancances formals que s’hauran d’esmenar per tal de poder iniciar l’activitat amb legalitat.</w:t>
+      <w:pPr>
+        <w:pStyle w:val="Ttulo2"/>
+      </w:pPr>
+      <w:r>
+        <w:t>Procediment d’esmena documentació</w:t>
       </w:r>
     </w:p>
     <w:p>
-      <w:pPr>
-        <w:pStyle w:val="Ttulo2"/>
-      </w:pPr>
-      <w:r>
-        <w:t>Procediment d’esmena documentació</w:t>
+      <w:r>
+        <w:t xml:space="preserve">Vist l’anterior, s’inicia d’ofici el procediment d’esmena, disposant </w:t>
+      </w:r>
+      <w:r>
+        <w:t>**</w:t>
+      </w:r>
+      <w:r>
+        <w:t xml:space="preserve">d’un </w:t>
+      </w:r>
+      <w:r>
+        <w:t>termini</w:t>
+      </w:r>
+      <w:r>
+        <w:t xml:space="preserve"> </w:t>
+      </w:r>
+      <w:r>
+        <w:rPr>
+          <w:rFonts w:eastAsia="MS Mincho" w:cs="Times New Roman"/>
+          <w:lang w:eastAsia="en-US"/>
+        </w:rPr>
+        <w:t xml:space="preserve">[OPCIO: Mesos procediment esmena | d’un mes | de dos mesos </w:t>
+      </w:r>
+      <w:r>
+        <w:t>degut a la complexitat de les actuacions que s’han de dur a terme per a esmenar les deficiències o per a complir els requisits exigits per la normativa sectorial aplicable</w:t>
+      </w:r>
+      <w:r>
+        <w:rPr>
+          <w:rFonts w:eastAsia="MS Mincho" w:cs="Times New Roman"/>
+          <w:lang w:eastAsia="en-US"/>
+        </w:rPr>
+        <w:t xml:space="preserve"> | de tres mesos</w:t>
+      </w:r>
+      <w:r>
+        <w:t xml:space="preserve"> degut a la complexitat de les actuacions que s’han de dur a terme per a esmenar les deficiències o per a complir els requisits exigits per la normativa sectorial aplicable</w:t>
+      </w:r>
+      <w:r>
+        <w:rPr>
+          <w:rFonts w:eastAsia="MS Mincho" w:cs="Times New Roman"/>
+          <w:lang w:eastAsia="en-US"/>
+        </w:rPr>
+        <w:t>]</w:t>
+      </w:r>
+      <w:r>
+        <w:rPr>
+          <w:rFonts w:eastAsia="MS Mincho" w:cs="Times New Roman"/>
+          <w:lang w:eastAsia="en-US"/>
+        </w:rPr>
+        <w:t>**</w:t>
+      </w:r>
+      <w:r>
+        <w:t xml:space="preserve"> per a esmenar els defectes constatats. En cas contrari és pertinent que la resolució del procediment administratiu determini el </w:t>
+      </w:r>
+      <w:r>
+        <w:t>**</w:t>
+      </w:r>
+      <w:r>
+        <w:t>cessament de l’activitat</w:t>
+      </w:r>
+      <w:r>
+        <w:t>**</w:t>
+      </w:r>
+      <w:r>
+        <w:t>.</w:t>
       </w:r>
     </w:p>
     <w:p>
-      <w:r>
-        <w:t xml:space="preserve">Vist l’anterior, s’inicia d’ofici el procediment d’esmena, disposant </w:t>
-      </w:r>
-      <w:r>
-        <w:t>**</w:t>
-      </w:r>
-      <w:r>
-        <w:t xml:space="preserve">d’un </w:t>
-      </w:r>
-      <w:r>
-        <w:t>termini</w:t>
-      </w:r>
-      <w:r>
-        <w:t xml:space="preserve"> </w:t>
-      </w:r>
-      <w:r>
-        <w:rPr>
-          <w:rFonts w:eastAsia="MS Mincho" w:cs="Times New Roman"/>
-          <w:lang w:eastAsia="en-US"/>
-        </w:rPr>
-        <w:t xml:space="preserve">[OPCIO: Mesos procediment esmena | d’un mes | de dos mesos </w:t>
-      </w:r>
-      <w:r>
-        <w:t>degut a la complexitat de les actuacions que s’han de dur a terme per a esmenar les deficiències o per a complir els requisits exigits per la normativa sectorial aplicable</w:t>
-      </w:r>
-      <w:r>
-        <w:rPr>
-          <w:rFonts w:eastAsia="MS Mincho" w:cs="Times New Roman"/>
-          <w:lang w:eastAsia="en-US"/>
-        </w:rPr>
-        <w:t xml:space="preserve"> | de tres mesos</w:t>
-      </w:r>
-      <w:r>
-        <w:t xml:space="preserve"> degut a la complexitat de les actuacions que s’han de dur a terme per a esmenar les deficiències o per a complir els requisits exigits per la normativa sectorial aplicable</w:t>
-      </w:r>
-      <w:r>
-        <w:rPr>
-          <w:rFonts w:eastAsia="MS Mincho" w:cs="Times New Roman"/>
-          <w:lang w:eastAsia="en-US"/>
-        </w:rPr>
-        <w:t>]</w:t>
-      </w:r>
-      <w:r>
-        <w:rPr>
-          <w:rFonts w:eastAsia="MS Mincho" w:cs="Times New Roman"/>
-          <w:lang w:eastAsia="en-US"/>
-        </w:rPr>
-        <w:t>**</w:t>
-      </w:r>
-      <w:r>
-        <w:t xml:space="preserve"> per a esmenar els defectes constatats. En cas contrari és pertinent que la resolució del procediment administratiu determini el </w:t>
-      </w:r>
-      <w:r>
-        <w:t>**</w:t>
-      </w:r>
-      <w:r>
-        <w:t>cessament de l’activitat</w:t>
-      </w:r>
-      <w:r>
-        <w:t>**</w:t>
-      </w:r>
-      <w:r>
-        <w:t>.</w:t>
+      <w:pPr>
+        <w:pStyle w:val="Ttulo2"/>
+      </w:pPr>
+      <w:r>
+        <w:t>Precinte inspecció activitat</w:t>
       </w:r>
     </w:p>
     <w:p>
-      <w:pPr>
-        <w:pStyle w:val="Ttulo2"/>
-      </w:pPr>
-      <w:r>
-        <w:t>Precinte inspecció activitat</w:t>
+      <w:r>
+        <w:t>Tenint</w:t>
+      </w:r>
+      <w:r>
+        <w:t xml:space="preserve"> en consideració el risc greu o imminent de seguretat sobre les persones, béns i el medi ambient que genera l’activitat </w:t>
+      </w:r>
+      <w:r>
+        <w:t>**</w:t>
+      </w:r>
+      <w:r>
+        <w:t xml:space="preserve">és pertinent precintar </w:t>
+      </w:r>
+      <w:r>
+        <w:t>[CAMP: què es precinta]</w:t>
+      </w:r>
+      <w:r>
+        <w:t>**</w:t>
+      </w:r>
+      <w:r>
+        <w:t xml:space="preserve"> fins a esmenar les deficiències en el cas de no presentar la documentació requerida en el termini</w:t>
+      </w:r>
+      <w:r>
+        <w:t xml:space="preserve"> </w:t>
+      </w:r>
+      <w:r>
+        <w:t>**</w:t>
+      </w:r>
+      <w:r>
+        <w:rPr>
+          <w:rFonts w:eastAsia="MS Mincho" w:cs="Times New Roman"/>
+          <w:lang w:eastAsia="en-US"/>
+        </w:rPr>
+        <w:t>[OPCIO: Mesos precint</w:t>
+      </w:r>
+      <w:r>
+        <w:rPr>
+          <w:rFonts w:eastAsia="MS Mincho" w:cs="Times New Roman"/>
+          <w:lang w:eastAsia="en-US"/>
+        </w:rPr>
+        <w:t>e</w:t>
+      </w:r>
+      <w:r>
+        <w:rPr>
+          <w:rFonts w:eastAsia="MS Mincho" w:cs="Times New Roman"/>
+          <w:lang w:eastAsia="en-US"/>
+        </w:rPr>
+        <w:t xml:space="preserve"> | d’un mes | de dos mesos | de tres mesos]</w:t>
+      </w:r>
+      <w:r>
+        <w:rPr>
+          <w:rFonts w:eastAsia="MS Mincho" w:cs="Times New Roman"/>
+          <w:lang w:eastAsia="en-US"/>
+        </w:rPr>
+        <w:t>**</w:t>
+      </w:r>
+      <w:r>
+        <w:t>.</w:t>
       </w:r>
     </w:p>
     <w:p>
-      <w:r>
-        <w:t>Tenint</w:t>
-      </w:r>
-      <w:r>
-        <w:t xml:space="preserve"> en consideració el risc greu o imminent de seguretat sobre les persones, béns i el medi ambient que genera l’activitat </w:t>
-      </w:r>
-      <w:r>
-        <w:t>**</w:t>
-      </w:r>
-      <w:r>
-        <w:t xml:space="preserve">és pertinent precintar </w:t>
-      </w:r>
-      <w:r>
-        <w:t>[CAMP: què es precinta]</w:t>
-      </w:r>
-      <w:r>
-        <w:t>**</w:t>
-      </w:r>
-      <w:r>
-        <w:t xml:space="preserve"> fins a esmenar les deficiències en el cas de no presentar la documentació requerida en el termini</w:t>
-      </w:r>
-      <w:r>
-        <w:t xml:space="preserve"> </w:t>
-      </w:r>
-      <w:r>
-        <w:t>**</w:t>
-      </w:r>
-      <w:r>
-        <w:rPr>
-          <w:rFonts w:eastAsia="MS Mincho" w:cs="Times New Roman"/>
-          <w:lang w:eastAsia="en-US"/>
-        </w:rPr>
-        <w:t>[OPCIO: Mesos precint</w:t>
-      </w:r>
-      <w:r>
-        <w:rPr>
-          <w:rFonts w:eastAsia="MS Mincho" w:cs="Times New Roman"/>
-          <w:lang w:eastAsia="en-US"/>
-        </w:rPr>
-        <w:t>e</w:t>
-      </w:r>
-      <w:r>
-        <w:rPr>
-          <w:rFonts w:eastAsia="MS Mincho" w:cs="Times New Roman"/>
-          <w:lang w:eastAsia="en-US"/>
-        </w:rPr>
-        <w:t xml:space="preserve"> | d’un mes | de dos mesos | de tres mesos]</w:t>
-      </w:r>
-      <w:r>
-        <w:rPr>
-          <w:rFonts w:eastAsia="MS Mincho" w:cs="Times New Roman"/>
-          <w:lang w:eastAsia="en-US"/>
-        </w:rPr>
-        <w:t>**</w:t>
-      </w:r>
-      <w:r>
-        <w:t>.</w:t>
+      <w:pPr>
+        <w:pStyle w:val="Ttulo1"/>
+      </w:pPr>
+      <w:r>
+        <w:t>SEGUIMENT</w:t>
       </w:r>
     </w:p>
     <w:p>
       <w:pPr>
-        <w:pStyle w:val="Ttulo1"/>
-      </w:pPr>
-      <w:r>
-        <w:t>SEGUIMENT</w:t>
+        <w:pStyle w:val="Ttulo2"/>
+        <w:rPr>
+          <w:lang w:eastAsia="en-US"/>
+        </w:rPr>
+      </w:pPr>
+      <w:r>
+        <w:rPr>
+          <w:lang w:eastAsia="en-US"/>
+        </w:rPr>
+        <w:t>Finalitzat</w:t>
       </w:r>
     </w:p>
     <w:p>
       <w:pPr>
-        <w:pStyle w:val="Ttulo2"/>
-        <w:rPr>
-          <w:lang w:eastAsia="en-US"/>
-        </w:rPr>
-      </w:pPr>
-      <w:r>
-        <w:rPr>
-          <w:lang w:eastAsia="en-US"/>
-        </w:rPr>
-        <w:t>Finalitzat</w:t>
+        <w:rPr>
+          <w:lang w:eastAsia="en-US"/>
+        </w:rPr>
+      </w:pPr>
+      <w:r>
+        <w:rPr>
+          <w:lang w:eastAsia="en-US"/>
+        </w:rPr>
+        <w:t xml:space="preserve">Vist l’anterior s’informa que </w:t>
+      </w:r>
+      <w:r>
+        <w:rPr>
+          <w:lang w:eastAsia="en-US"/>
+        </w:rPr>
+        <w:t>**</w:t>
+      </w:r>
+      <w:r>
+        <w:rPr>
+          <w:lang w:eastAsia="en-US"/>
+        </w:rPr>
+        <w:t>es pot donar per finalitzat el procediment d’esmena</w:t>
+      </w:r>
+      <w:r>
+        <w:rPr>
+          <w:lang w:eastAsia="en-US"/>
+        </w:rPr>
+        <w:t>**</w:t>
+      </w:r>
+      <w:r>
+        <w:rPr>
+          <w:lang w:eastAsia="en-US"/>
+        </w:rPr>
+        <w:t>.</w:t>
       </w:r>
     </w:p>
     <w:p>
       <w:pPr>
-        <w:rPr>
-          <w:lang w:eastAsia="en-US"/>
-        </w:rPr>
-      </w:pPr>
-      <w:r>
-        <w:rPr>
-          <w:lang w:eastAsia="en-US"/>
-        </w:rPr>
-        <w:t xml:space="preserve">Vist l’anterior s’informa que </w:t>
-      </w:r>
-      <w:r>
-        <w:rPr>
-          <w:lang w:eastAsia="en-US"/>
-        </w:rPr>
-        <w:t>**</w:t>
-      </w:r>
-      <w:r>
-        <w:rPr>
-          <w:lang w:eastAsia="en-US"/>
-        </w:rPr>
-        <w:t>es pot donar per finalitzat el procediment d’esmena</w:t>
-      </w:r>
-      <w:r>
-        <w:rPr>
-          <w:lang w:eastAsia="en-US"/>
-        </w:rPr>
-        <w:t>**</w:t>
-      </w:r>
-      <w:r>
-        <w:rPr>
-          <w:lang w:eastAsia="en-US"/>
-        </w:rPr>
-        <w:t>.</w:t>
+        <w:pStyle w:val="Ttulo2"/>
+        <w:rPr>
+          <w:lang w:eastAsia="en-US"/>
+        </w:rPr>
+      </w:pPr>
+      <w:r>
+        <w:rPr>
+          <w:lang w:eastAsia="en-US"/>
+        </w:rPr>
+        <w:t>NO finalitzat</w:t>
       </w:r>
     </w:p>
     <w:p>
       <w:pPr>
-        <w:pStyle w:val="Ttulo2"/>
-        <w:rPr>
-          <w:lang w:eastAsia="en-US"/>
-        </w:rPr>
-      </w:pPr>
-      <w:r>
-        <w:rPr>
-          <w:lang w:eastAsia="en-US"/>
-        </w:rPr>
-        <w:t>NO finalitzat</w:t>
+        <w:rPr>
+          <w:lang w:eastAsia="en-US"/>
+        </w:rPr>
+      </w:pPr>
+      <w:r>
+        <w:rPr>
+          <w:lang w:eastAsia="en-US"/>
+        </w:rPr>
+        <w:t xml:space="preserve">Vist l’anterior s’informa que </w:t>
+      </w:r>
+      <w:r>
+        <w:rPr>
+          <w:lang w:eastAsia="en-US"/>
+        </w:rPr>
+        <w:t xml:space="preserve">**NO </w:t>
+      </w:r>
+      <w:r>
+        <w:rPr>
+          <w:lang w:eastAsia="en-US"/>
+        </w:rPr>
+        <w:t>es pot donar per finalitzat el procediment d’esmena</w:t>
+      </w:r>
+      <w:r>
+        <w:rPr>
+          <w:lang w:eastAsia="en-US"/>
+        </w:rPr>
+        <w:t>**</w:t>
+      </w:r>
+      <w:r>
+        <w:rPr>
+          <w:lang w:eastAsia="en-US"/>
+        </w:rPr>
+        <w:t>.</w:t>
       </w:r>
     </w:p>
     <w:p>
       <w:pPr>
-        <w:rPr>
-          <w:lang w:eastAsia="en-US"/>
-        </w:rPr>
-      </w:pPr>
-      <w:r>
-        <w:rPr>
-          <w:lang w:eastAsia="en-US"/>
-        </w:rPr>
-        <w:t xml:space="preserve">Vist l’anterior s’informa que </w:t>
-      </w:r>
-      <w:r>
-        <w:rPr>
-          <w:lang w:eastAsia="en-US"/>
-        </w:rPr>
-        <w:t xml:space="preserve">**NO </w:t>
-      </w:r>
-      <w:r>
-        <w:rPr>
-          <w:lang w:eastAsia="en-US"/>
-        </w:rPr>
-        <w:t>es pot donar per finalitzat el procediment d’esmena</w:t>
-      </w:r>
-      <w:r>
-        <w:rPr>
-          <w:lang w:eastAsia="en-US"/>
-        </w:rPr>
-        <w:t>**</w:t>
-      </w:r>
-      <w:r>
-        <w:rPr>
-          <w:lang w:eastAsia="en-US"/>
-        </w:rPr>
-        <w:t>.</w:t>
+        <w:pStyle w:val="Ttulo2"/>
+        <w:rPr>
+          <w:lang w:eastAsia="en-US"/>
+        </w:rPr>
+      </w:pPr>
+      <w:r>
+        <w:rPr>
+          <w:lang w:eastAsia="en-US"/>
+        </w:rPr>
+        <w:lastRenderedPageBreak/>
+        <w:t>NO finalitzat però aixecar cessament</w:t>
       </w:r>
     </w:p>
     <w:p>
       <w:pPr>
-        <w:pStyle w:val="Ttulo2"/>
-        <w:rPr>
-          <w:lang w:eastAsia="en-US"/>
-        </w:rPr>
-      </w:pPr>
-      <w:r>
-        <w:rPr>
-          <w:lang w:eastAsia="en-US"/>
-        </w:rPr>
-        <w:t>NO finalitzat però aixecar cessament</w:t>
+        <w:rPr>
+          <w:lang w:eastAsia="en-US"/>
+        </w:rPr>
+      </w:pPr>
+      <w:r>
+        <w:rPr>
+          <w:lang w:eastAsia="en-US"/>
+        </w:rPr>
+        <w:t xml:space="preserve">Vist l’anterior s’informa que </w:t>
+      </w:r>
+      <w:r>
+        <w:rPr>
+          <w:lang w:eastAsia="en-US"/>
+        </w:rPr>
+        <w:t xml:space="preserve">**NO </w:t>
+      </w:r>
+      <w:r>
+        <w:rPr>
+          <w:lang w:eastAsia="en-US"/>
+        </w:rPr>
+        <w:t>es pot donar per finalitzat el procediment d’esmena</w:t>
+      </w:r>
+      <w:r>
+        <w:t xml:space="preserve"> </w:t>
+      </w:r>
+      <w:r>
+        <w:rPr>
+          <w:lang w:eastAsia="en-US"/>
+        </w:rPr>
+        <w:t>però</w:t>
+      </w:r>
+      <w:r>
+        <w:rPr>
+          <w:lang w:eastAsia="en-US"/>
+        </w:rPr>
+        <w:t>**</w:t>
+      </w:r>
+      <w:r>
+        <w:rPr>
+          <w:lang w:eastAsia="en-US"/>
+        </w:rPr>
+        <w:t xml:space="preserve"> tenint en compte les actuacions que s’han dut a terme, </w:t>
+      </w:r>
+      <w:r>
+        <w:rPr>
+          <w:lang w:eastAsia="en-US"/>
+        </w:rPr>
+        <w:t>**</w:t>
+      </w:r>
+      <w:r>
+        <w:rPr>
+          <w:lang w:eastAsia="en-US"/>
+        </w:rPr>
+        <w:t>es valora ampliar el termini</w:t>
+      </w:r>
+      <w:r>
+        <w:rPr>
+          <w:lang w:eastAsia="en-US"/>
+        </w:rPr>
+        <w:t xml:space="preserve"> </w:t>
+      </w:r>
+      <w:r>
+        <w:rPr>
+          <w:rFonts w:eastAsia="MS Mincho" w:cs="Times New Roman"/>
+          <w:lang w:eastAsia="en-US"/>
+        </w:rPr>
+        <w:t xml:space="preserve">[OPCIO: Mesos </w:t>
+      </w:r>
+      <w:r>
+        <w:rPr>
+          <w:rFonts w:eastAsia="MS Mincho" w:cs="Times New Roman"/>
+          <w:lang w:eastAsia="en-US"/>
+        </w:rPr>
+        <w:t>ampliació</w:t>
+      </w:r>
+      <w:r>
+        <w:rPr>
+          <w:rFonts w:eastAsia="MS Mincho" w:cs="Times New Roman"/>
+          <w:lang w:eastAsia="en-US"/>
+        </w:rPr>
+        <w:t xml:space="preserve"> | un mes | dos mesos]</w:t>
+      </w:r>
+      <w:r>
+        <w:rPr>
+          <w:lang w:eastAsia="en-US"/>
+        </w:rPr>
+        <w:t xml:space="preserve"> i aixe</w:t>
+      </w:r>
+      <w:r>
+        <w:rPr>
+          <w:lang w:eastAsia="en-US"/>
+        </w:rPr>
+        <w:t>car el cessament de l’activitat**</w:t>
+      </w:r>
+      <w:r>
+        <w:rPr>
+          <w:lang w:eastAsia="en-US"/>
+        </w:rPr>
+        <w:t>.</w:t>
       </w:r>
     </w:p>
     <w:p>
       <w:pPr>
-        <w:rPr>
-          <w:lang w:eastAsia="en-US"/>
-        </w:rPr>
-      </w:pPr>
-      <w:r>
-        <w:rPr>
-          <w:lang w:eastAsia="en-US"/>
-        </w:rPr>
-        <w:t xml:space="preserve">Vist l’anterior s’informa que </w:t>
-      </w:r>
-      <w:r>
-        <w:rPr>
-          <w:lang w:eastAsia="en-US"/>
-        </w:rPr>
-        <w:t xml:space="preserve">**NO </w:t>
-      </w:r>
-      <w:r>
-        <w:rPr>
-          <w:lang w:eastAsia="en-US"/>
-        </w:rPr>
-        <w:t>es pot donar per finalitzat el procediment d’esmena</w:t>
-      </w:r>
-      <w:r>
-        <w:t xml:space="preserve"> </w:t>
-      </w:r>
-      <w:r>
-        <w:rPr>
-          <w:lang w:eastAsia="en-US"/>
-        </w:rPr>
-        <w:t>però</w:t>
-      </w:r>
-      <w:r>
-        <w:rPr>
-          <w:lang w:eastAsia="en-US"/>
-        </w:rPr>
-        <w:t>**</w:t>
-      </w:r>
-      <w:r>
-        <w:rPr>
-          <w:lang w:eastAsia="en-US"/>
-        </w:rPr>
-        <w:t xml:space="preserve"> tenint en compte les actuacions que s’han dut a terme, </w:t>
-      </w:r>
-      <w:r>
-        <w:rPr>
-          <w:lang w:eastAsia="en-US"/>
-        </w:rPr>
-        <w:t>**</w:t>
-      </w:r>
-      <w:r>
-        <w:rPr>
-          <w:lang w:eastAsia="en-US"/>
-        </w:rPr>
-        <w:t>es valora ampliar el termini</w:t>
-      </w:r>
-      <w:r>
-        <w:rPr>
-          <w:lang w:eastAsia="en-US"/>
-        </w:rPr>
-        <w:t xml:space="preserve"> </w:t>
-      </w:r>
-      <w:r>
-        <w:rPr>
-          <w:rFonts w:eastAsia="MS Mincho" w:cs="Times New Roman"/>
-          <w:lang w:eastAsia="en-US"/>
-        </w:rPr>
-        <w:t xml:space="preserve">[OPCIO: Mesos </w:t>
-      </w:r>
-      <w:r>
-        <w:rPr>
-          <w:rFonts w:eastAsia="MS Mincho" w:cs="Times New Roman"/>
-          <w:lang w:eastAsia="en-US"/>
-        </w:rPr>
-        <w:t>ampliació</w:t>
-      </w:r>
-      <w:r>
-        <w:rPr>
-          <w:rFonts w:eastAsia="MS Mincho" w:cs="Times New Roman"/>
-          <w:lang w:eastAsia="en-US"/>
-        </w:rPr>
-        <w:t xml:space="preserve"> | un mes | dos mesos]</w:t>
-      </w:r>
-      <w:r>
-        <w:rPr>
-          <w:lang w:eastAsia="en-US"/>
-        </w:rPr>
-        <w:t xml:space="preserve"> i aixe</w:t>
-      </w:r>
-      <w:r>
-        <w:rPr>
-          <w:lang w:eastAsia="en-US"/>
-        </w:rPr>
-        <w:t>car el cessament de l’activitat**</w:t>
-      </w:r>
-      <w:r>
-        <w:rPr>
-          <w:lang w:eastAsia="en-US"/>
-        </w:rPr>
-        <w:t>.</w:t>
-      </w:r>
-    </w:p>
-    <w:p>
-      <w:pPr>
         <w:pStyle w:val="Ttulo2"/>
         <w:rPr>
           <w:lang w:eastAsia="en-US"/>
@@ -448,7 +474,6 @@
         <w:rPr>
           <w:lang w:eastAsia="en-US"/>
         </w:rPr>
-        <w:lastRenderedPageBreak/>
         <w:t>Tancament denúncia</w:t>
       </w:r>
     </w:p>
@@ -4388,7 +4413,7 @@
 </file>
 
 <file path=customXml/itemProps1.xml><?xml version="1.0" encoding="utf-8"?>
-<ds:datastoreItem xmlns:ds="http://schemas.openxmlformats.org/officeDocument/2006/customXml" ds:itemID="{1BE26EFE-6F67-41AB-A064-12D038DB8615}">
+<ds:datastoreItem xmlns:ds="http://schemas.openxmlformats.org/officeDocument/2006/customXml" ds:itemID="{F7712A46-26C6-4825-A8A1-5865B1D95F2B}">
   <ds:schemaRefs>
     <ds:schemaRef ds:uri="http://schemas.openxmlformats.org/officeDocument/2006/bibliography"/>
   </ds:schemaRefs>

</xml_diff>

<commit_message>
Catalegs, plantilles i dades del mobil actualitzats des de Actualitzar.bat
</commit_message>
<xml_diff>
--- a/ESTRUCTURALS/0 CONCLUSIONS.docx
+++ b/ESTRUCTURALS/0 CONCLUSIONS.docx
@@ -2,36 +2,46 @@
 <file path=word/document.xml><?xml version="1.0" encoding="utf-8"?>
 <w:document xmlns:wpc="http://schemas.microsoft.com/office/word/2010/wordprocessingCanvas" xmlns:cx="http://schemas.microsoft.com/office/drawing/2014/chartex" xmlns:cx1="http://schemas.microsoft.com/office/drawing/2015/9/8/chartex" xmlns:mc="http://schemas.openxmlformats.org/markup-compatibility/2006" xmlns:o="urn:schemas-microsoft-com:office:office" xmlns:r="http://schemas.openxmlformats.org/officeDocument/2006/relationships" xmlns:m="http://schemas.openxmlformats.org/officeDocument/2006/math" xmlns:v="urn:schemas-microsoft-com:vml" xmlns:wp14="http://schemas.microsoft.com/office/word/2010/wordprocessingDrawing" xmlns:wp="http://schemas.openxmlformats.org/drawingml/2006/wordprocessingDrawing" xmlns:w10="urn:schemas-microsoft-com:office:word" xmlns:w="http://schemas.openxmlformats.org/wordprocessingml/2006/main" xmlns:w14="http://schemas.microsoft.com/office/word/2010/wordml" xmlns:w15="http://schemas.microsoft.com/office/word/2012/wordml" xmlns:w16se="http://schemas.microsoft.com/office/word/2015/wordml/symex" xmlns:wpg="http://schemas.microsoft.com/office/word/2010/wordprocessingGroup" xmlns:wpi="http://schemas.microsoft.com/office/word/2010/wordprocessingInk" xmlns:wne="http://schemas.microsoft.com/office/word/2006/wordml" xmlns:wps="http://schemas.microsoft.com/office/word/2010/wordprocessingShape" mc:Ignorable="w14 w15 w16se wp14">
   <w:body>
-    <w:p>
-      <w:pPr>
-        <w:pStyle w:val="Ttulo1"/>
-      </w:pPr>
-      <w:r>
-        <w:t>Conclusions</w:t>
-      </w:r>
-    </w:p>
-    <w:p>
+    <w:p/>
+    <w:p>
+      <w:pPr>
+        <w:spacing w:after="0"/>
+        <w:outlineLvl w:val="0"/>
+      </w:pPr>
       <w:r>
         <w:t>CONCLUSIONS</w:t>
       </w:r>
     </w:p>
     <w:p>
       <w:pPr>
-        <w:pStyle w:val="Ttulo1"/>
-      </w:pPr>
-      <w:r>
-        <w:t>Conclusions de: REQ1</w:t>
-      </w:r>
-    </w:p>
-    <w:p>
-      <w:pPr>
-        <w:pStyle w:val="Ttulo2"/>
-      </w:pPr>
-      <w:r>
-        <w:t>Desistiment</w:t>
-      </w:r>
-    </w:p>
-    <w:p>
+        <w:spacing w:after="0"/>
+      </w:pPr>
+    </w:p>
+    <w:p>
+      <w:pPr>
+        <w:spacing w:after="0"/>
+        <w:outlineLvl w:val="0"/>
+      </w:pPr>
+      <w:r>
+        <w:t>CONCLUSIONS DE REQ1</w:t>
+      </w:r>
+    </w:p>
+    <w:p>
+      <w:pPr>
+        <w:spacing w:after="0"/>
+      </w:pPr>
+    </w:p>
+    <w:p>
+      <w:pPr>
+        <w:spacing w:after="0"/>
+        <w:outlineLvl w:val="2"/>
+      </w:pPr>
+      <w:r>
+        <w:rPr>
+          <w:b/>
+        </w:rPr>
+        <w:t xml:space="preserve">1. </w:t>
+      </w:r>
       <w:r>
         <w:t xml:space="preserve">Vist l’anterior, com que la comunicació presenta un o més defectes de caràcter essencial </w:t>
       </w:r>
@@ -47,52 +57,80 @@
     </w:p>
     <w:p>
       <w:pPr>
-        <w:pStyle w:val="Ttulo2"/>
-      </w:pPr>
-      <w:r>
-        <w:t>Terrassa projecte</w:t>
-      </w:r>
-    </w:p>
-    <w:p>
+        <w:spacing w:after="0"/>
+      </w:pPr>
+    </w:p>
+    <w:p>
+      <w:pPr>
+        <w:spacing w:after="0"/>
+        <w:outlineLvl w:val="2"/>
+      </w:pPr>
+      <w:r>
+        <w:rPr>
+          <w:b/>
+        </w:rPr>
+        <w:t xml:space="preserve">2. </w:t>
+      </w:r>
       <w:r>
         <w:t>La terrassa que apareix en el projecte no forma part d’aquest informe ni d’aquest expedient.</w:t>
       </w:r>
     </w:p>
     <w:p>
       <w:pPr>
-        <w:pStyle w:val="Ttulo2"/>
-      </w:pPr>
-      <w:r>
-        <w:t>Requeriment</w:t>
-      </w:r>
-    </w:p>
-    <w:p>
+        <w:spacing w:after="0"/>
+      </w:pPr>
+    </w:p>
+    <w:p>
+      <w:pPr>
+        <w:spacing w:after="0"/>
+        <w:outlineLvl w:val="2"/>
+      </w:pPr>
+      <w:r>
+        <w:rPr>
+          <w:b/>
+        </w:rPr>
+        <w:t xml:space="preserve">3. </w:t>
+      </w:r>
       <w:r>
         <w:t>Vist l’anterior, cal requerir l’esmena de les deficiències indicades, aportant la documentació corresponent i presentant la mateixa en un termini màxim de quinze dies, a comptar des de l’endemà de la recepció del requeriment.</w:t>
       </w:r>
     </w:p>
     <w:p>
       <w:pPr>
-        <w:pStyle w:val="Ttulo2"/>
-      </w:pPr>
-      <w:r>
-        <w:t>Mancances formals</w:t>
-      </w:r>
-    </w:p>
-    <w:p>
+        <w:spacing w:after="0"/>
+      </w:pPr>
+    </w:p>
+    <w:p>
+      <w:pPr>
+        <w:spacing w:after="0"/>
+        <w:outlineLvl w:val="2"/>
+      </w:pPr>
+      <w:r>
+        <w:rPr>
+          <w:b/>
+        </w:rPr>
+        <w:t xml:space="preserve">4. </w:t>
+      </w:r>
       <w:r>
         <w:t>Vist l’anterior, la comunicació presenta mancances formals que s’hauran d’esmenar per tal de poder iniciar l’activitat amb legalitat.</w:t>
       </w:r>
     </w:p>
     <w:p>
       <w:pPr>
-        <w:pStyle w:val="Ttulo2"/>
-      </w:pPr>
-      <w:r>
-        <w:t>Procediment d’esmena documentació</w:t>
-      </w:r>
-    </w:p>
-    <w:p>
+        <w:spacing w:after="0"/>
+      </w:pPr>
+    </w:p>
+    <w:p>
+      <w:pPr>
+        <w:spacing w:after="0"/>
+        <w:outlineLvl w:val="2"/>
+      </w:pPr>
+      <w:r>
+        <w:rPr>
+          <w:b/>
+        </w:rPr>
+        <w:t xml:space="preserve">5. </w:t>
+      </w:r>
       <w:r>
         <w:t xml:space="preserve">Vist l’anterior, s’inicia d’ofici el procediment d’esmena, disposant </w:t>
       </w:r>
@@ -117,13 +155,20 @@
     </w:p>
     <w:p>
       <w:pPr>
-        <w:pStyle w:val="Ttulo2"/>
-      </w:pPr>
-      <w:r>
-        <w:t>Precinte inspecció activitat</w:t>
-      </w:r>
-    </w:p>
-    <w:p>
+        <w:spacing w:after="0"/>
+      </w:pPr>
+    </w:p>
+    <w:p>
+      <w:pPr>
+        <w:spacing w:after="0"/>
+        <w:outlineLvl w:val="2"/>
+      </w:pPr>
+      <w:r>
+        <w:rPr>
+          <w:b/>
+        </w:rPr>
+        <w:t xml:space="preserve">6. </w:t>
+      </w:r>
       <w:r>
         <w:t xml:space="preserve">Tenint en consideració el risc greu o imminent de seguretat sobre les persones, béns i el medi ambient que genera l’activitat </w:t>
       </w:r>
@@ -148,21 +193,39 @@
     </w:p>
     <w:p>
       <w:pPr>
-        <w:pStyle w:val="Ttulo1"/>
-      </w:pPr>
-      <w:r>
-        <w:t>Conclusions de: SEGUIMENT</w:t>
-      </w:r>
-    </w:p>
-    <w:p>
-      <w:pPr>
-        <w:pStyle w:val="Ttulo2"/>
-      </w:pPr>
-      <w:r>
-        <w:t>Finalitzat</w:t>
-      </w:r>
-    </w:p>
-    <w:p>
+        <w:spacing w:after="0"/>
+      </w:pPr>
+    </w:p>
+    <w:p>
+      <w:pPr>
+        <w:spacing w:after="0"/>
+      </w:pPr>
+    </w:p>
+    <w:p>
+      <w:pPr>
+        <w:spacing w:after="0"/>
+        <w:outlineLvl w:val="0"/>
+      </w:pPr>
+      <w:r>
+        <w:t>CONCLUSIONS DE SEGUIMENT</w:t>
+      </w:r>
+    </w:p>
+    <w:p>
+      <w:pPr>
+        <w:spacing w:after="0"/>
+      </w:pPr>
+    </w:p>
+    <w:p>
+      <w:pPr>
+        <w:spacing w:after="0"/>
+        <w:outlineLvl w:val="2"/>
+      </w:pPr>
+      <w:r>
+        <w:rPr>
+          <w:b/>
+        </w:rPr>
+        <w:t xml:space="preserve">1. </w:t>
+      </w:r>
       <w:r>
         <w:t xml:space="preserve">Vist l’anterior s’informa que </w:t>
       </w:r>
@@ -178,13 +241,20 @@
     </w:p>
     <w:p>
       <w:pPr>
-        <w:pStyle w:val="Ttulo2"/>
-      </w:pPr>
-      <w:r>
-        <w:t>NO finalitzat</w:t>
-      </w:r>
-    </w:p>
-    <w:p>
+        <w:spacing w:after="0"/>
+      </w:pPr>
+    </w:p>
+    <w:p>
+      <w:pPr>
+        <w:spacing w:after="0"/>
+        <w:outlineLvl w:val="2"/>
+      </w:pPr>
+      <w:r>
+        <w:rPr>
+          <w:b/>
+        </w:rPr>
+        <w:t xml:space="preserve">2. </w:t>
+      </w:r>
       <w:r>
         <w:t xml:space="preserve">Vist l’anterior s’informa que </w:t>
       </w:r>
@@ -200,13 +270,20 @@
     </w:p>
     <w:p>
       <w:pPr>
-        <w:pStyle w:val="Ttulo2"/>
-      </w:pPr>
-      <w:r>
-        <w:t>NO finalitzat però aixecar cessament</w:t>
-      </w:r>
-    </w:p>
-    <w:p>
+        <w:spacing w:after="0"/>
+      </w:pPr>
+    </w:p>
+    <w:p>
+      <w:pPr>
+        <w:spacing w:after="0"/>
+        <w:outlineLvl w:val="2"/>
+      </w:pPr>
+      <w:r>
+        <w:rPr>
+          <w:b/>
+        </w:rPr>
+        <w:t xml:space="preserve">3. </w:t>
+      </w:r>
       <w:r>
         <w:t xml:space="preserve">Vist l’anterior s’informa que </w:t>
       </w:r>
@@ -231,13 +308,20 @@
     </w:p>
     <w:p>
       <w:pPr>
-        <w:pStyle w:val="Ttulo2"/>
-      </w:pPr>
-      <w:r>
-        <w:t>Tancament denúncia</w:t>
-      </w:r>
-    </w:p>
-    <w:p>
+        <w:spacing w:after="0"/>
+      </w:pPr>
+    </w:p>
+    <w:p>
+      <w:pPr>
+        <w:spacing w:after="0"/>
+        <w:outlineLvl w:val="2"/>
+      </w:pPr>
+      <w:r>
+        <w:rPr>
+          <w:b/>
+        </w:rPr>
+        <w:t xml:space="preserve">4. </w:t>
+      </w:r>
       <w:r>
         <w:t xml:space="preserve">Vist l’anterior s’informa que </w:t>
       </w:r>
@@ -253,34 +337,59 @@
     </w:p>
     <w:p>
       <w:pPr>
-        <w:pStyle w:val="Ttulo2"/>
-      </w:pPr>
-      <w:r>
-        <w:t>Tancament denúncia + inici procediment esmena</w:t>
-      </w:r>
-    </w:p>
-    <w:p>
+        <w:spacing w:after="0"/>
+      </w:pPr>
+    </w:p>
+    <w:p>
+      <w:pPr>
+        <w:spacing w:after="0"/>
+        <w:outlineLvl w:val="2"/>
+      </w:pPr>
+      <w:r>
+        <w:rPr>
+          <w:b/>
+        </w:rPr>
+        <w:t xml:space="preserve">5. </w:t>
+      </w:r>
       <w:r>
         <w:t>Vist l’anterior, es s’informa que es pot donar per tancada la denúncia.</w:t>
       </w:r>
     </w:p>
     <w:p>
       <w:pPr>
-        <w:pStyle w:val="Ttulo1"/>
-      </w:pPr>
-      <w:r>
-        <w:t>Conclusions de: TERMINI</w:t>
-      </w:r>
-    </w:p>
-    <w:p>
-      <w:pPr>
-        <w:pStyle w:val="Ttulo2"/>
-      </w:pPr>
-      <w:r>
-        <w:t>Ampliar</w:t>
-      </w:r>
-    </w:p>
-    <w:p>
+        <w:spacing w:after="0"/>
+      </w:pPr>
+    </w:p>
+    <w:p>
+      <w:pPr>
+        <w:spacing w:after="0"/>
+      </w:pPr>
+    </w:p>
+    <w:p>
+      <w:pPr>
+        <w:spacing w:after="0"/>
+        <w:outlineLvl w:val="0"/>
+      </w:pPr>
+      <w:r>
+        <w:t>CONCLUSIONS DE TERMINI</w:t>
+      </w:r>
+    </w:p>
+    <w:p>
+      <w:pPr>
+        <w:spacing w:after="0"/>
+      </w:pPr>
+    </w:p>
+    <w:p>
+      <w:pPr>
+        <w:spacing w:after="0"/>
+        <w:outlineLvl w:val="2"/>
+      </w:pPr>
+      <w:r>
+        <w:rPr>
+          <w:b/>
+        </w:rPr>
+        <w:t xml:space="preserve">1. </w:t>
+      </w:r>
       <w:r>
         <w:t xml:space="preserve">Vist l’anterior, i tenint en compte les actuacions que s’han de dur a terme, es valora </w:t>
       </w:r>
@@ -296,13 +405,20 @@
     </w:p>
     <w:p>
       <w:pPr>
-        <w:pStyle w:val="Ttulo2"/>
-      </w:pPr>
-      <w:r>
-        <w:t>No ampliar</w:t>
-      </w:r>
-    </w:p>
-    <w:p>
+        <w:spacing w:after="0"/>
+      </w:pPr>
+    </w:p>
+    <w:p>
+      <w:pPr>
+        <w:spacing w:after="0"/>
+        <w:outlineLvl w:val="2"/>
+      </w:pPr>
+      <w:r>
+        <w:rPr>
+          <w:b/>
+        </w:rPr>
+        <w:t xml:space="preserve">2. </w:t>
+      </w:r>
       <w:r>
         <w:t xml:space="preserve">Vist l’anterior, i tenint en compte les actuacions que s’han de dur a terme, es valora </w:t>
       </w:r>
@@ -318,32 +434,59 @@
     </w:p>
     <w:p>
       <w:pPr>
-        <w:pStyle w:val="Ttulo1"/>
-      </w:pPr>
-      <w:r>
-        <w:t>Frases que surten SEMPRE</w:t>
-      </w:r>
-    </w:p>
-    <w:p>
+        <w:spacing w:after="0"/>
+      </w:pPr>
+    </w:p>
+    <w:p>
+      <w:pPr>
+        <w:spacing w:after="0"/>
+      </w:pPr>
+    </w:p>
+    <w:p>
+      <w:pPr>
+        <w:spacing w:after="0"/>
+        <w:outlineLvl w:val="0"/>
+      </w:pPr>
+      <w:r>
+        <w:t>FRASES QUE SURTEN SEMPRE</w:t>
+      </w:r>
+    </w:p>
+    <w:p>
+      <w:pPr>
+        <w:spacing w:after="0"/>
+      </w:pPr>
+    </w:p>
+    <w:p>
+      <w:pPr>
+        <w:spacing w:after="0"/>
+      </w:pPr>
       <w:r>
         <w:t>Ho poso al seu coneixement als efectes oportuns,</w:t>
       </w:r>
     </w:p>
     <w:p>
+      <w:pPr>
+        <w:spacing w:after="0"/>
+      </w:pPr>
       <w:r>
         <w:t>Cornellà de Llobregat,</w:t>
       </w:r>
     </w:p>
-    <w:p/>
-    <w:p>
+    <w:p>
+      <w:pPr>
+        <w:spacing w:after="0"/>
+      </w:pPr>
+    </w:p>
+    <w:p>
+      <w:pPr>
+        <w:spacing w:after="0"/>
+      </w:pPr>
       <w:r>
         <w:rPr>
           <w:i/>
         </w:rPr>
-        <w:t>Vista generada automàticament des de 0 CONCLUSIONS.json el 28/07/2026 14:48. No l'editis: els canvis es fan des de l'editor de catàlegs del programa.</w:t>
-      </w:r>
-    </w:p>
-    <w:p>
+        <w:t>Vista generada automàticament des de 0 CONCLUSIONS.json el 28/07/2026 15:04. No l'editis: els canvis es fan des de l'editor de catàlegs del programa.</w:t>
+      </w:r>
       <w:bookmarkStart w:id="0" w:name="_GoBack"/>
       <w:bookmarkEnd w:id="0"/>
     </w:p>
@@ -754,49 +897,6 @@
       <w:lang w:val="ca-ES"/>
     </w:rPr>
   </w:style>
-  <w:style w:type="paragraph" w:styleId="Ttulo1">
-    <w:name w:val="heading 1"/>
-    <w:basedOn w:val="Normal"/>
-    <w:next w:val="Normal"/>
-    <w:link w:val="Ttulo1Car"/>
-    <w:uiPriority w:val="9"/>
-    <w:qFormat/>
-    <w:rsid w:val="00582B2D"/>
-    <w:pPr>
-      <w:keepNext/>
-      <w:keepLines/>
-      <w:spacing w:before="240" w:after="0"/>
-      <w:outlineLvl w:val="0"/>
-    </w:pPr>
-    <w:rPr>
-      <w:rFonts w:asciiTheme="majorHAnsi" w:eastAsiaTheme="majorEastAsia" w:hAnsiTheme="majorHAnsi" w:cstheme="majorBidi"/>
-      <w:color w:val="2E74B5" w:themeColor="accent1" w:themeShade="BF"/>
-      <w:sz w:val="32"/>
-      <w:szCs w:val="32"/>
-    </w:rPr>
-  </w:style>
-  <w:style w:type="paragraph" w:styleId="Ttulo2">
-    <w:name w:val="heading 2"/>
-    <w:basedOn w:val="Normal"/>
-    <w:next w:val="Normal"/>
-    <w:link w:val="Ttulo2Car"/>
-    <w:uiPriority w:val="9"/>
-    <w:unhideWhenUsed/>
-    <w:qFormat/>
-    <w:rsid w:val="00582B2D"/>
-    <w:pPr>
-      <w:keepNext/>
-      <w:keepLines/>
-      <w:spacing w:before="40" w:after="0"/>
-      <w:outlineLvl w:val="1"/>
-    </w:pPr>
-    <w:rPr>
-      <w:rFonts w:asciiTheme="majorHAnsi" w:eastAsiaTheme="majorEastAsia" w:hAnsiTheme="majorHAnsi" w:cstheme="majorBidi"/>
-      <w:color w:val="2E74B5" w:themeColor="accent1" w:themeShade="BF"/>
-      <w:sz w:val="26"/>
-      <w:szCs w:val="26"/>
-    </w:rPr>
-  </w:style>
   <w:style w:type="character" w:default="1" w:styleId="Fuentedeprrafopredeter">
     <w:name w:val="Default Paragraph Font"/>
     <w:uiPriority w:val="1"/>
@@ -823,34 +923,6 @@
     <w:uiPriority w:val="99"/>
     <w:semiHidden/>
     <w:unhideWhenUsed/>
-  </w:style>
-  <w:style w:type="character" w:customStyle="1" w:styleId="Ttulo1Car">
-    <w:name w:val="Título 1 Car"/>
-    <w:basedOn w:val="Fuentedeprrafopredeter"/>
-    <w:link w:val="Ttulo1"/>
-    <w:uiPriority w:val="9"/>
-    <w:rsid w:val="00582B2D"/>
-    <w:rPr>
-      <w:rFonts w:asciiTheme="majorHAnsi" w:eastAsiaTheme="majorEastAsia" w:hAnsiTheme="majorHAnsi" w:cstheme="majorBidi"/>
-      <w:color w:val="2E74B5" w:themeColor="accent1" w:themeShade="BF"/>
-      <w:sz w:val="32"/>
-      <w:szCs w:val="32"/>
-      <w:lang w:val="ca-ES"/>
-    </w:rPr>
-  </w:style>
-  <w:style w:type="character" w:customStyle="1" w:styleId="Ttulo2Car">
-    <w:name w:val="Título 2 Car"/>
-    <w:basedOn w:val="Fuentedeprrafopredeter"/>
-    <w:link w:val="Ttulo2"/>
-    <w:uiPriority w:val="9"/>
-    <w:rsid w:val="00582B2D"/>
-    <w:rPr>
-      <w:rFonts w:asciiTheme="majorHAnsi" w:eastAsiaTheme="majorEastAsia" w:hAnsiTheme="majorHAnsi" w:cstheme="majorBidi"/>
-      <w:color w:val="2E74B5" w:themeColor="accent1" w:themeShade="BF"/>
-      <w:sz w:val="26"/>
-      <w:szCs w:val="26"/>
-      <w:lang w:val="ca-ES"/>
-    </w:rPr>
   </w:style>
 </w:styles>
 </file>

</xml_diff>